<commit_message>
Add openpyxl to requirements for Manual Listings tab
Co-Authored-By: Claude Sonnet 4.6 <noreply@anthropic.com>
</commit_message>
<xml_diff>
--- a/West_Michigan_Land_Tool_Roadmap.docx
+++ b/West_Michigan_Land_Tool_Roadmap.docx
@@ -339,7 +339,7 @@
                 <w:rFonts w:ascii="Arial" w:hAnsi="Arial"/>
                 <w:sz w:val="20"/>
               </w:rPr>
-              <w:t>Via GRAR or WLAR OAuth credentials</w:t>
+              <w:t>Via SWMRC / MichRIC OAuth credentials</w:t>
             </w:r>
           </w:p>
         </w:tc>
@@ -595,7 +595,7 @@
                 <w:rFonts w:ascii="Arial" w:hAnsi="Arial"/>
                 <w:sz w:val="20"/>
               </w:rPr>
-              <w:t>MLS (GRAR / WLAR)</w:t>
+              <w:t>MLS (SWMRC / MichRIC)</w:t>
             </w:r>
           </w:p>
         </w:tc>
@@ -1141,6 +1141,192 @@
           </w:p>
         </w:tc>
       </w:tr>
+      <w:tr>
+        <w:tc>
+          <w:tcPr>
+            <w:tcW w:w="2880" w:type="dxa"/>
+            <w:shd w:val="clear" w:color="auto" w:fill="FFFFFF"/>
+          </w:tcPr>
+          <w:p>
+            <w:r>
+              <w:rPr>
+                <w:rFonts w:ascii="Arial" w:hAnsi="Arial"/>
+                <w:sz w:val="20"/>
+              </w:rPr>
+              <w:t>CARWM</w:t>
+            </w:r>
+          </w:p>
+        </w:tc>
+        <w:tc>
+          <w:tcPr>
+            <w:tcW w:w="2592" w:type="dxa"/>
+            <w:shd w:val="clear" w:color="auto" w:fill="FFFFFF"/>
+          </w:tcPr>
+          <w:p>
+            <w:r>
+              <w:rPr>
+                <w:rFonts w:ascii="Arial" w:hAnsi="Arial"/>
+                <w:sz w:val="20"/>
+              </w:rPr>
+              <w:t>Commercial land listings (occasional residential)</w:t>
+            </w:r>
+          </w:p>
+        </w:tc>
+        <w:tc>
+          <w:tcPr>
+            <w:tcW w:w="3168" w:type="dxa"/>
+            <w:shd w:val="clear" w:color="auto" w:fill="FFFFFF"/>
+          </w:tcPr>
+          <w:p>
+            <w:r>
+              <w:rPr>
+                <w:rFonts w:ascii="Arial" w:hAnsi="Arial"/>
+                <w:sz w:val="20"/>
+              </w:rPr>
+              <w:t>Manual spot-check; uploaded to Manual Listings tab in app</w:t>
+            </w:r>
+          </w:p>
+        </w:tc>
+        <w:tc>
+          <w:tcPr>
+            <w:tcW w:w="2160" w:type="dxa"/>
+            <w:shd w:val="clear" w:color="auto" w:fill="FFFFFF"/>
+          </w:tcPr>
+          <w:p>
+            <w:r>
+              <w:rPr>
+                <w:rFonts w:ascii="Arial" w:hAnsi="Arial"/>
+                <w:sz w:val="20"/>
+              </w:rPr>
+              <w:t>Manual (API via Resimplifi possible in future)</w:t>
+            </w:r>
+          </w:p>
+        </w:tc>
+      </w:tr>
+      <w:tr>
+        <w:tc>
+          <w:tcPr>
+            <w:tcW w:w="2880" w:type="dxa"/>
+            <w:shd w:val="clear" w:color="auto" w:fill="DEEAF1"/>
+          </w:tcPr>
+          <w:p>
+            <w:r>
+              <w:rPr>
+                <w:rFonts w:ascii="Arial" w:hAnsi="Arial"/>
+                <w:sz w:val="20"/>
+              </w:rPr>
+              <w:t>Facebook Marketplace</w:t>
+            </w:r>
+          </w:p>
+        </w:tc>
+        <w:tc>
+          <w:tcPr>
+            <w:tcW w:w="2592" w:type="dxa"/>
+            <w:shd w:val="clear" w:color="auto" w:fill="DEEAF1"/>
+          </w:tcPr>
+          <w:p>
+            <w:r>
+              <w:rPr>
+                <w:rFonts w:ascii="Arial" w:hAnsi="Arial"/>
+                <w:sz w:val="20"/>
+              </w:rPr>
+              <w:t>FSBO land listings</w:t>
+            </w:r>
+          </w:p>
+        </w:tc>
+        <w:tc>
+          <w:tcPr>
+            <w:tcW w:w="3168" w:type="dxa"/>
+            <w:shd w:val="clear" w:color="auto" w:fill="DEEAF1"/>
+          </w:tcPr>
+          <w:p>
+            <w:r>
+              <w:rPr>
+                <w:rFonts w:ascii="Arial" w:hAnsi="Arial"/>
+                <w:sz w:val="20"/>
+              </w:rPr>
+              <w:t>Manual spot-check; uploaded to Manual Listings tab in app</w:t>
+            </w:r>
+          </w:p>
+        </w:tc>
+        <w:tc>
+          <w:tcPr>
+            <w:tcW w:w="2160" w:type="dxa"/>
+            <w:shd w:val="clear" w:color="auto" w:fill="DEEAF1"/>
+          </w:tcPr>
+          <w:p>
+            <w:r>
+              <w:rPr>
+                <w:rFonts w:ascii="Arial" w:hAnsi="Arial"/>
+                <w:sz w:val="20"/>
+              </w:rPr>
+              <w:t>Manual (no public API available)</w:t>
+            </w:r>
+          </w:p>
+        </w:tc>
+      </w:tr>
+      <w:tr>
+        <w:tc>
+          <w:tcPr>
+            <w:tcW w:w="2880" w:type="dxa"/>
+            <w:shd w:val="clear" w:color="auto" w:fill="FFFFFF"/>
+          </w:tcPr>
+          <w:p>
+            <w:r>
+              <w:rPr>
+                <w:rFonts w:ascii="Arial" w:hAnsi="Arial"/>
+                <w:sz w:val="20"/>
+              </w:rPr>
+              <w:t>Craigslist</w:t>
+            </w:r>
+          </w:p>
+        </w:tc>
+        <w:tc>
+          <w:tcPr>
+            <w:tcW w:w="2592" w:type="dxa"/>
+            <w:shd w:val="clear" w:color="auto" w:fill="FFFFFF"/>
+          </w:tcPr>
+          <w:p>
+            <w:r>
+              <w:rPr>
+                <w:rFonts w:ascii="Arial" w:hAnsi="Arial"/>
+                <w:sz w:val="20"/>
+              </w:rPr>
+              <w:t>FSBO land listings</w:t>
+            </w:r>
+          </w:p>
+        </w:tc>
+        <w:tc>
+          <w:tcPr>
+            <w:tcW w:w="3168" w:type="dxa"/>
+            <w:shd w:val="clear" w:color="auto" w:fill="FFFFFF"/>
+          </w:tcPr>
+          <w:p>
+            <w:r>
+              <w:rPr>
+                <w:rFonts w:ascii="Arial" w:hAnsi="Arial"/>
+                <w:sz w:val="20"/>
+              </w:rPr>
+              <w:t>Manual spot-check; uploaded to Manual Listings tab in app</w:t>
+            </w:r>
+          </w:p>
+        </w:tc>
+        <w:tc>
+          <w:tcPr>
+            <w:tcW w:w="2160" w:type="dxa"/>
+            <w:shd w:val="clear" w:color="auto" w:fill="FFFFFF"/>
+          </w:tcPr>
+          <w:p>
+            <w:r>
+              <w:rPr>
+                <w:rFonts w:ascii="Arial" w:hAnsi="Arial"/>
+                <w:sz w:val="20"/>
+              </w:rPr>
+              <w:t>Manual (no public API available)</w:t>
+            </w:r>
+          </w:p>
+        </w:tc>
+      </w:tr>
     </w:tbl>
     <w:p/>
     <w:p>

</xml_diff>